<commit_message>
PAUSED (task165): stage 4 round 2 fix pass in, waiting on the re-judge and the re-read
The arterial figures are asked to the nearest 50 t: the records' route and the
loading-log calibration file one figure in every cell, each 17.2 t or more from
an edge. Block 2 is stated at the precision every construction shares (about
700 t, under 2 t a lane-km; about 5 t a lane-km). Each winter now carries its
own swing, the earlier moves follow their programmes (377), the audit keys
changes in sittings; R_MID re-centred by the written rule, golden 2,213.7 t.

Co-Authored-By: Claude Opus 5.5 <noreply@anthropic.com>
Claude-Session: https://claude.ai/code/session_01A6XcFx5t62c7gPi1bBKcVi
</commit_message>
<xml_diff>
--- a/task165/golden/seasonal_salt_commitment_council_report.docx
+++ b/task165/golden/seasonal_salt_commitment_council_report.docx
@@ -149,7 +149,7 @@
         <w:rPr>
           <w:b w:val="0"/>
         </w:rPr>
-        <w:t>At Priority 2 our trucks salted these streets at their intersections and little else, 1.7 t a lane-km in a winter of that severity. The collectors we moved to Priority 1 between 2022 and 2025 were mostly hill, school and hospital streets that Priority 2 already salted along much of their length, and their spreader records show the gain from the move falling the more Priority 2 salt a street already took. Read at these streets' own Priority 2 salt, the move adds 5.2 t a lane-km.</w:t>
+        <w:t>At Priority 2 our trucks salted these streets at their intersections and little else, about 700 t in a winter of that severity, under 2 t a lane-km. The collectors we moved to Priority 1 between 2022 and 2025 were mostly hill, school and hospital streets that Priority 2 already salted along much of their length, and their spreader records show the gain from the move falling the more Priority 2 salt a street already took. Read at these streets' own Priority 2 salt, the move adds about 5 t a lane-km.</w:t>
       </w:r>
     </w:p>
     <w:p>
@@ -212,7 +212,7 @@
           <w:color w:val="52514E"/>
           <w:sz w:val="17"/>
         </w:rPr>
-        <w:t>Contract circuits are included; each yard's figure is for the arterial circuits it ran that winter. WSI is the Roads Operations Centre's Winter Severity Index (plan section 4).</w:t>
+        <w:t>Tonnes to the nearest 50. Contract circuits are included; each yard's figure is for the arterial circuits it ran that winter. WSI is the Roads Operations Centre's Winter Severity Index (plan section 4).</w:t>
       </w:r>
     </w:p>
     <w:sectPr>

</xml_diff>